<commit_message>
Added docs - Ex-Form, COTS_Export_Process_Review_Docx
</commit_message>
<xml_diff>
--- a/COTs_Export_Merged_Docs/WorkFlows/COTS_Export_Process_Review_MeetingPack_7Sep2026.docx
+++ b/COTs_Export_Merged_Docs/WorkFlows/COTS_Export_Process_Review_MeetingPack_7Sep2026.docx
@@ -177,12 +177,6 @@
         <w:gridCol w:w="8520"/>
       </w:tblGrid>
       <w:tr>
-        <w:tblPrEx>
-          <w:tblCellMar>
-            <w:top w:w="0" w:type="dxa"/>
-            <w:bottom w:w="0" w:type="dxa"/>
-          </w:tblCellMar>
-        </w:tblPrEx>
         <w:trPr>
           <w:tblHeader/>
         </w:trPr>
@@ -236,12 +230,6 @@
         </w:tc>
       </w:tr>
       <w:tr>
-        <w:tblPrEx>
-          <w:tblCellMar>
-            <w:top w:w="0" w:type="dxa"/>
-            <w:bottom w:w="0" w:type="dxa"/>
-          </w:tblCellMar>
-        </w:tblPrEx>
         <w:trPr>
           <w:cantSplit/>
         </w:trPr>
@@ -293,12 +281,6 @@
         </w:tc>
       </w:tr>
       <w:tr>
-        <w:tblPrEx>
-          <w:tblCellMar>
-            <w:top w:w="0" w:type="dxa"/>
-            <w:bottom w:w="0" w:type="dxa"/>
-          </w:tblCellMar>
-        </w:tblPrEx>
         <w:trPr>
           <w:cantSplit/>
         </w:trPr>
@@ -352,12 +334,6 @@
         </w:tc>
       </w:tr>
       <w:tr>
-        <w:tblPrEx>
-          <w:tblCellMar>
-            <w:top w:w="0" w:type="dxa"/>
-            <w:bottom w:w="0" w:type="dxa"/>
-          </w:tblCellMar>
-        </w:tblPrEx>
         <w:trPr>
           <w:cantSplit/>
         </w:trPr>
@@ -409,12 +385,6 @@
         </w:tc>
       </w:tr>
       <w:tr>
-        <w:tblPrEx>
-          <w:tblCellMar>
-            <w:top w:w="0" w:type="dxa"/>
-            <w:bottom w:w="0" w:type="dxa"/>
-          </w:tblCellMar>
-        </w:tblPrEx>
         <w:trPr>
           <w:cantSplit/>
         </w:trPr>
@@ -587,12 +557,6 @@
         <w:gridCol w:w="5480"/>
       </w:tblGrid>
       <w:tr>
-        <w:tblPrEx>
-          <w:tblCellMar>
-            <w:top w:w="0" w:type="dxa"/>
-            <w:bottom w:w="0" w:type="dxa"/>
-          </w:tblCellMar>
-        </w:tblPrEx>
         <w:trPr>
           <w:tblHeader/>
         </w:trPr>
@@ -659,12 +623,6 @@
         </w:tc>
       </w:tr>
       <w:tr>
-        <w:tblPrEx>
-          <w:tblCellMar>
-            <w:top w:w="0" w:type="dxa"/>
-            <w:bottom w:w="0" w:type="dxa"/>
-          </w:tblCellMar>
-        </w:tblPrEx>
         <w:trPr>
           <w:cantSplit/>
         </w:trPr>
@@ -732,12 +690,6 @@
         </w:tc>
       </w:tr>
       <w:tr>
-        <w:tblPrEx>
-          <w:tblCellMar>
-            <w:top w:w="0" w:type="dxa"/>
-            <w:bottom w:w="0" w:type="dxa"/>
-          </w:tblCellMar>
-        </w:tblPrEx>
         <w:trPr>
           <w:cantSplit/>
         </w:trPr>
@@ -808,12 +760,6 @@
         </w:tc>
       </w:tr>
       <w:tr>
-        <w:tblPrEx>
-          <w:tblCellMar>
-            <w:top w:w="0" w:type="dxa"/>
-            <w:bottom w:w="0" w:type="dxa"/>
-          </w:tblCellMar>
-        </w:tblPrEx>
         <w:trPr>
           <w:cantSplit/>
         </w:trPr>
@@ -881,12 +827,6 @@
         </w:tc>
       </w:tr>
       <w:tr>
-        <w:tblPrEx>
-          <w:tblCellMar>
-            <w:top w:w="0" w:type="dxa"/>
-            <w:bottom w:w="0" w:type="dxa"/>
-          </w:tblCellMar>
-        </w:tblPrEx>
         <w:trPr>
           <w:cantSplit/>
         </w:trPr>
@@ -957,12 +897,6 @@
         </w:tc>
       </w:tr>
       <w:tr>
-        <w:tblPrEx>
-          <w:tblCellMar>
-            <w:top w:w="0" w:type="dxa"/>
-            <w:bottom w:w="0" w:type="dxa"/>
-          </w:tblCellMar>
-        </w:tblPrEx>
         <w:trPr>
           <w:cantSplit/>
         </w:trPr>
@@ -1030,12 +964,6 @@
         </w:tc>
       </w:tr>
       <w:tr>
-        <w:tblPrEx>
-          <w:tblCellMar>
-            <w:top w:w="0" w:type="dxa"/>
-            <w:bottom w:w="0" w:type="dxa"/>
-          </w:tblCellMar>
-        </w:tblPrEx>
         <w:trPr>
           <w:cantSplit/>
         </w:trPr>
@@ -1159,12 +1087,6 @@
         <w:gridCol w:w="2920"/>
       </w:tblGrid>
       <w:tr>
-        <w:tblPrEx>
-          <w:tblCellMar>
-            <w:top w:w="0" w:type="dxa"/>
-            <w:bottom w:w="0" w:type="dxa"/>
-          </w:tblCellMar>
-        </w:tblPrEx>
         <w:trPr>
           <w:tblHeader/>
         </w:trPr>
@@ -1266,12 +1188,6 @@
         </w:tc>
       </w:tr>
       <w:tr>
-        <w:tblPrEx>
-          <w:tblCellMar>
-            <w:top w:w="0" w:type="dxa"/>
-            <w:bottom w:w="0" w:type="dxa"/>
-          </w:tblCellMar>
-        </w:tblPrEx>
         <w:trPr>
           <w:cantSplit/>
         </w:trPr>
@@ -1375,12 +1291,6 @@
         </w:tc>
       </w:tr>
       <w:tr>
-        <w:tblPrEx>
-          <w:tblCellMar>
-            <w:top w:w="0" w:type="dxa"/>
-            <w:bottom w:w="0" w:type="dxa"/>
-          </w:tblCellMar>
-        </w:tblPrEx>
         <w:trPr>
           <w:cantSplit/>
         </w:trPr>
@@ -1472,12 +1382,6 @@
         </w:tc>
       </w:tr>
       <w:tr>
-        <w:tblPrEx>
-          <w:tblCellMar>
-            <w:top w:w="0" w:type="dxa"/>
-            <w:bottom w:w="0" w:type="dxa"/>
-          </w:tblCellMar>
-        </w:tblPrEx>
         <w:trPr>
           <w:cantSplit/>
         </w:trPr>
@@ -1574,12 +1478,6 @@
         </w:tc>
       </w:tr>
       <w:tr>
-        <w:tblPrEx>
-          <w:tblCellMar>
-            <w:top w:w="0" w:type="dxa"/>
-            <w:bottom w:w="0" w:type="dxa"/>
-          </w:tblCellMar>
-        </w:tblPrEx>
         <w:trPr>
           <w:cantSplit/>
         </w:trPr>
@@ -1671,12 +1569,6 @@
         </w:tc>
       </w:tr>
       <w:tr>
-        <w:tblPrEx>
-          <w:tblCellMar>
-            <w:top w:w="0" w:type="dxa"/>
-            <w:bottom w:w="0" w:type="dxa"/>
-          </w:tblCellMar>
-        </w:tblPrEx>
         <w:trPr>
           <w:cantSplit/>
         </w:trPr>
@@ -1857,12 +1749,6 @@
         <w:gridCol w:w="3000"/>
       </w:tblGrid>
       <w:tr>
-        <w:tblPrEx>
-          <w:tblCellMar>
-            <w:top w:w="0" w:type="dxa"/>
-            <w:bottom w:w="0" w:type="dxa"/>
-          </w:tblCellMar>
-        </w:tblPrEx>
         <w:trPr>
           <w:tblHeader/>
         </w:trPr>
@@ -1988,12 +1874,6 @@
         </w:tc>
       </w:tr>
       <w:tr>
-        <w:tblPrEx>
-          <w:tblCellMar>
-            <w:top w:w="0" w:type="dxa"/>
-            <w:bottom w:w="0" w:type="dxa"/>
-          </w:tblCellMar>
-        </w:tblPrEx>
         <w:trPr>
           <w:cantSplit/>
         </w:trPr>
@@ -2135,12 +2015,6 @@
         </w:tc>
       </w:tr>
       <w:tr>
-        <w:tblPrEx>
-          <w:tblCellMar>
-            <w:top w:w="0" w:type="dxa"/>
-            <w:bottom w:w="0" w:type="dxa"/>
-          </w:tblCellMar>
-        </w:tblPrEx>
         <w:trPr>
           <w:cantSplit/>
         </w:trPr>
@@ -2299,12 +2173,6 @@
         </w:tc>
       </w:tr>
       <w:tr>
-        <w:tblPrEx>
-          <w:tblCellMar>
-            <w:top w:w="0" w:type="dxa"/>
-            <w:bottom w:w="0" w:type="dxa"/>
-          </w:tblCellMar>
-        </w:tblPrEx>
         <w:trPr>
           <w:cantSplit/>
         </w:trPr>
@@ -2458,12 +2326,6 @@
         </w:tc>
       </w:tr>
       <w:tr>
-        <w:tblPrEx>
-          <w:tblCellMar>
-            <w:top w:w="0" w:type="dxa"/>
-            <w:bottom w:w="0" w:type="dxa"/>
-          </w:tblCellMar>
-        </w:tblPrEx>
         <w:trPr>
           <w:cantSplit/>
         </w:trPr>
@@ -2668,12 +2530,6 @@
         <w:gridCol w:w="3000"/>
       </w:tblGrid>
       <w:tr>
-        <w:tblPrEx>
-          <w:tblCellMar>
-            <w:top w:w="0" w:type="dxa"/>
-            <w:bottom w:w="0" w:type="dxa"/>
-          </w:tblCellMar>
-        </w:tblPrEx>
         <w:trPr>
           <w:tblHeader/>
         </w:trPr>
@@ -2799,12 +2655,6 @@
         </w:tc>
       </w:tr>
       <w:tr>
-        <w:tblPrEx>
-          <w:tblCellMar>
-            <w:top w:w="0" w:type="dxa"/>
-            <w:bottom w:w="0" w:type="dxa"/>
-          </w:tblCellMar>
-        </w:tblPrEx>
         <w:trPr>
           <w:cantSplit/>
         </w:trPr>
@@ -2973,12 +2823,6 @@
         </w:tc>
       </w:tr>
       <w:tr>
-        <w:tblPrEx>
-          <w:tblCellMar>
-            <w:top w:w="0" w:type="dxa"/>
-            <w:bottom w:w="0" w:type="dxa"/>
-          </w:tblCellMar>
-        </w:tblPrEx>
         <w:trPr>
           <w:cantSplit/>
         </w:trPr>
@@ -3137,12 +2981,6 @@
         </w:tc>
       </w:tr>
       <w:tr>
-        <w:tblPrEx>
-          <w:tblCellMar>
-            <w:top w:w="0" w:type="dxa"/>
-            <w:bottom w:w="0" w:type="dxa"/>
-          </w:tblCellMar>
-        </w:tblPrEx>
         <w:trPr>
           <w:cantSplit/>
         </w:trPr>
@@ -3296,12 +3134,6 @@
         </w:tc>
       </w:tr>
       <w:tr>
-        <w:tblPrEx>
-          <w:tblCellMar>
-            <w:top w:w="0" w:type="dxa"/>
-            <w:bottom w:w="0" w:type="dxa"/>
-          </w:tblCellMar>
-        </w:tblPrEx>
         <w:trPr>
           <w:cantSplit/>
         </w:trPr>
@@ -3480,12 +3312,6 @@
         </w:tc>
       </w:tr>
       <w:tr>
-        <w:tblPrEx>
-          <w:tblCellMar>
-            <w:top w:w="0" w:type="dxa"/>
-            <w:bottom w:w="0" w:type="dxa"/>
-          </w:tblCellMar>
-        </w:tblPrEx>
         <w:trPr>
           <w:cantSplit/>
         </w:trPr>
@@ -3655,12 +3481,6 @@
         </w:tc>
       </w:tr>
       <w:tr>
-        <w:tblPrEx>
-          <w:tblCellMar>
-            <w:top w:w="0" w:type="dxa"/>
-            <w:bottom w:w="0" w:type="dxa"/>
-          </w:tblCellMar>
-        </w:tblPrEx>
         <w:trPr>
           <w:cantSplit/>
         </w:trPr>
@@ -3829,12 +3649,6 @@
         </w:tc>
       </w:tr>
       <w:tr>
-        <w:tblPrEx>
-          <w:tblCellMar>
-            <w:top w:w="0" w:type="dxa"/>
-            <w:bottom w:w="0" w:type="dxa"/>
-          </w:tblCellMar>
-        </w:tblPrEx>
         <w:trPr>
           <w:cantSplit/>
         </w:trPr>
@@ -4009,12 +3823,6 @@
         </w:tc>
       </w:tr>
       <w:tr>
-        <w:tblPrEx>
-          <w:tblCellMar>
-            <w:top w:w="0" w:type="dxa"/>
-            <w:bottom w:w="0" w:type="dxa"/>
-          </w:tblCellMar>
-        </w:tblPrEx>
         <w:trPr>
           <w:cantSplit/>
         </w:trPr>
@@ -4193,12 +4001,6 @@
         </w:tc>
       </w:tr>
       <w:tr>
-        <w:tblPrEx>
-          <w:tblCellMar>
-            <w:top w:w="0" w:type="dxa"/>
-            <w:bottom w:w="0" w:type="dxa"/>
-          </w:tblCellMar>
-        </w:tblPrEx>
         <w:trPr>
           <w:cantSplit/>
         </w:trPr>
@@ -4408,12 +4210,6 @@
         <w:gridCol w:w="3000"/>
       </w:tblGrid>
       <w:tr>
-        <w:tblPrEx>
-          <w:tblCellMar>
-            <w:top w:w="0" w:type="dxa"/>
-            <w:bottom w:w="0" w:type="dxa"/>
-          </w:tblCellMar>
-        </w:tblPrEx>
         <w:trPr>
           <w:tblHeader/>
         </w:trPr>
@@ -4539,12 +4335,6 @@
         </w:tc>
       </w:tr>
       <w:tr>
-        <w:tblPrEx>
-          <w:tblCellMar>
-            <w:top w:w="0" w:type="dxa"/>
-            <w:bottom w:w="0" w:type="dxa"/>
-          </w:tblCellMar>
-        </w:tblPrEx>
         <w:trPr>
           <w:cantSplit/>
         </w:trPr>
@@ -4698,12 +4488,6 @@
         </w:tc>
       </w:tr>
       <w:tr>
-        <w:tblPrEx>
-          <w:tblCellMar>
-            <w:top w:w="0" w:type="dxa"/>
-            <w:bottom w:w="0" w:type="dxa"/>
-          </w:tblCellMar>
-        </w:tblPrEx>
         <w:trPr>
           <w:cantSplit/>
         </w:trPr>
@@ -4767,6 +4551,14 @@
           <w:p>
             <w:pPr>
               <w:spacing w:line="230" w:lineRule="auto"/>
+              <w:rPr>
+                <w:b/>
+                <w:bCs/>
+                <w:color w:val="1B4F72"/>
+                <w:sz w:val="18"/>
+                <w:szCs w:val="18"/>
+                <w:u w:val="single" w:color="1B4F72"/>
+              </w:rPr>
             </w:pPr>
             <w:hyperlink w:anchor="step_5_1" w:history="1">
               <w:r>
@@ -4783,8 +4575,12 @@
             </w:hyperlink>
             <w:r>
               <w:rPr>
-                <w:sz w:val="18"/>
-                <w:szCs w:val="18"/>
+                <w:b/>
+                <w:bCs/>
+                <w:color w:val="1B4F72"/>
+                <w:sz w:val="18"/>
+                <w:szCs w:val="18"/>
+                <w:u w:val="single" w:color="1B4F72"/>
               </w:rPr>
               <w:t xml:space="preserve">; </w:t>
             </w:r>
@@ -4803,8 +4599,12 @@
             </w:hyperlink>
             <w:r>
               <w:rPr>
-                <w:sz w:val="18"/>
-                <w:szCs w:val="18"/>
+                <w:b/>
+                <w:bCs/>
+                <w:color w:val="1B4F72"/>
+                <w:sz w:val="18"/>
+                <w:szCs w:val="18"/>
+                <w:u w:val="single" w:color="1B4F72"/>
               </w:rPr>
               <w:t xml:space="preserve">; </w:t>
             </w:r>
@@ -4821,6 +4621,49 @@
                 <w:t>3.4</w:t>
               </w:r>
             </w:hyperlink>
+            <w:r>
+              <w:rPr>
+                <w:b/>
+                <w:bCs/>
+                <w:color w:val="1B4F72"/>
+                <w:sz w:val="18"/>
+                <w:szCs w:val="18"/>
+                <w:u w:val="single" w:color="1B4F72"/>
+              </w:rPr>
+              <w:t xml:space="preserve">, </w:t>
+            </w:r>
+            <w:hyperlink w:anchor="step_10_1" w:history="1">
+              <w:r>
+                <w:rPr>
+                  <w:rStyle w:val="Hyperlink"/>
+                  <w:b/>
+                  <w:bCs/>
+                  <w:sz w:val="18"/>
+                  <w:szCs w:val="18"/>
+                </w:rPr>
+                <w:t>10</w:t>
+              </w:r>
+              <w:r>
+                <w:rPr>
+                  <w:rStyle w:val="Hyperlink"/>
+                  <w:b/>
+                  <w:bCs/>
+                  <w:sz w:val="18"/>
+                  <w:szCs w:val="18"/>
+                </w:rPr>
+                <w:t>.</w:t>
+              </w:r>
+              <w:r>
+                <w:rPr>
+                  <w:rStyle w:val="Hyperlink"/>
+                  <w:b/>
+                  <w:bCs/>
+                  <w:sz w:val="18"/>
+                  <w:szCs w:val="18"/>
+                </w:rPr>
+                <w:t>1</w:t>
+              </w:r>
+            </w:hyperlink>
           </w:p>
         </w:tc>
         <w:tc>
@@ -4902,12 +4745,6 @@
         </w:tc>
       </w:tr>
       <w:tr>
-        <w:tblPrEx>
-          <w:tblCellMar>
-            <w:top w:w="0" w:type="dxa"/>
-            <w:bottom w:w="0" w:type="dxa"/>
-          </w:tblCellMar>
-        </w:tblPrEx>
         <w:trPr>
           <w:cantSplit/>
         </w:trPr>
@@ -4979,7 +4816,29 @@
                   <w:szCs w:val="18"/>
                   <w:u w:val="single" w:color="1B4F72"/>
                 </w:rPr>
-                <w:t>2.8</w:t>
+                <w:t>2</w:t>
+              </w:r>
+              <w:r>
+                <w:rPr>
+                  <w:b/>
+                  <w:bCs/>
+                  <w:color w:val="1B4F72"/>
+                  <w:sz w:val="18"/>
+                  <w:szCs w:val="18"/>
+                  <w:u w:val="single" w:color="1B4F72"/>
+                </w:rPr>
+                <w:t>.</w:t>
+              </w:r>
+              <w:r>
+                <w:rPr>
+                  <w:b/>
+                  <w:bCs/>
+                  <w:color w:val="1B4F72"/>
+                  <w:sz w:val="18"/>
+                  <w:szCs w:val="18"/>
+                  <w:u w:val="single" w:color="1B4F72"/>
+                </w:rPr>
+                <w:t>8</w:t>
               </w:r>
             </w:hyperlink>
           </w:p>
@@ -5061,12 +4920,6 @@
         </w:tc>
       </w:tr>
       <w:tr>
-        <w:tblPrEx>
-          <w:tblCellMar>
-            <w:top w:w="0" w:type="dxa"/>
-            <w:bottom w:w="0" w:type="dxa"/>
-          </w:tblCellMar>
-        </w:tblPrEx>
         <w:trPr>
           <w:cantSplit/>
         </w:trPr>
@@ -5221,16 +5074,28 @@
               </w:rPr>
               <w:t>List and record screen only — no create form.</w:t>
             </w:r>
+            <w:r>
+              <w:rPr>
+                <w:color w:val="5A6672"/>
+                <w:sz w:val="17"/>
+                <w:szCs w:val="17"/>
+              </w:rPr>
+              <w:t xml:space="preserve"> </w:t>
+            </w:r>
+            <w:r>
+              <w:rPr>
+                <w:b/>
+                <w:bCs/>
+                <w:color w:val="5A6672"/>
+                <w:sz w:val="17"/>
+                <w:szCs w:val="17"/>
+              </w:rPr>
+              <w:t>(For Sudan only)</w:t>
+            </w:r>
           </w:p>
         </w:tc>
       </w:tr>
       <w:tr>
-        <w:tblPrEx>
-          <w:tblCellMar>
-            <w:top w:w="0" w:type="dxa"/>
-            <w:bottom w:w="0" w:type="dxa"/>
-          </w:tblCellMar>
-        </w:tblPrEx>
         <w:trPr>
           <w:cantSplit/>
         </w:trPr>
@@ -5302,18 +5167,7 @@
                   <w:szCs w:val="18"/>
                   <w:u w:val="single" w:color="1B4F72"/>
                 </w:rPr>
-                <w:t>6.</w:t>
-              </w:r>
-              <w:r>
-                <w:rPr>
-                  <w:b/>
-                  <w:bCs/>
-                  <w:color w:val="1B4F72"/>
-                  <w:sz w:val="18"/>
-                  <w:szCs w:val="18"/>
-                  <w:u w:val="single" w:color="1B4F72"/>
-                </w:rPr>
-                <w:t>1</w:t>
+                <w:t>6.1</w:t>
               </w:r>
             </w:hyperlink>
           </w:p>
@@ -5413,12 +5267,6 @@
         </w:tc>
       </w:tr>
       <w:tr>
-        <w:tblPrEx>
-          <w:tblCellMar>
-            <w:top w:w="0" w:type="dxa"/>
-            <w:bottom w:w="0" w:type="dxa"/>
-          </w:tblCellMar>
-        </w:tblPrEx>
         <w:trPr>
           <w:cantSplit/>
         </w:trPr>
@@ -5577,12 +5425,6 @@
         </w:tc>
       </w:tr>
       <w:tr>
-        <w:tblPrEx>
-          <w:tblCellMar>
-            <w:top w:w="0" w:type="dxa"/>
-            <w:bottom w:w="0" w:type="dxa"/>
-          </w:tblCellMar>
-        </w:tblPrEx>
         <w:trPr>
           <w:cantSplit/>
         </w:trPr>
@@ -5782,12 +5624,6 @@
         <w:gridCol w:w="3000"/>
       </w:tblGrid>
       <w:tr>
-        <w:tblPrEx>
-          <w:tblCellMar>
-            <w:top w:w="0" w:type="dxa"/>
-            <w:bottom w:w="0" w:type="dxa"/>
-          </w:tblCellMar>
-        </w:tblPrEx>
         <w:trPr>
           <w:tblHeader/>
         </w:trPr>
@@ -5913,12 +5749,6 @@
         </w:tc>
       </w:tr>
       <w:tr>
-        <w:tblPrEx>
-          <w:tblCellMar>
-            <w:top w:w="0" w:type="dxa"/>
-            <w:bottom w:w="0" w:type="dxa"/>
-          </w:tblCellMar>
-        </w:tblPrEx>
         <w:trPr>
           <w:cantSplit/>
         </w:trPr>
@@ -5990,29 +5820,7 @@
                   <w:szCs w:val="18"/>
                   <w:u w:val="single" w:color="1B4F72"/>
                 </w:rPr>
-                <w:t>5</w:t>
-              </w:r>
-              <w:r>
-                <w:rPr>
-                  <w:b/>
-                  <w:bCs/>
-                  <w:color w:val="1B4F72"/>
-                  <w:sz w:val="18"/>
-                  <w:szCs w:val="18"/>
-                  <w:u w:val="single" w:color="1B4F72"/>
-                </w:rPr>
-                <w:t>.</w:t>
-              </w:r>
-              <w:r>
-                <w:rPr>
-                  <w:b/>
-                  <w:bCs/>
-                  <w:color w:val="1B4F72"/>
-                  <w:sz w:val="18"/>
-                  <w:szCs w:val="18"/>
-                  <w:u w:val="single" w:color="1B4F72"/>
-                </w:rPr>
-                <w:t>3</w:t>
+                <w:t>5.3</w:t>
               </w:r>
             </w:hyperlink>
           </w:p>
@@ -6120,12 +5928,6 @@
         </w:tc>
       </w:tr>
       <w:tr>
-        <w:tblPrEx>
-          <w:tblCellMar>
-            <w:top w:w="0" w:type="dxa"/>
-            <w:bottom w:w="0" w:type="dxa"/>
-          </w:tblCellMar>
-        </w:tblPrEx>
         <w:trPr>
           <w:cantSplit/>
         </w:trPr>
@@ -6305,12 +6107,6 @@
         </w:tc>
       </w:tr>
       <w:tr>
-        <w:tblPrEx>
-          <w:tblCellMar>
-            <w:top w:w="0" w:type="dxa"/>
-            <w:bottom w:w="0" w:type="dxa"/>
-          </w:tblCellMar>
-        </w:tblPrEx>
         <w:trPr>
           <w:cantSplit/>
         </w:trPr>
@@ -6447,12 +6243,6 @@
         </w:tc>
       </w:tr>
       <w:tr>
-        <w:tblPrEx>
-          <w:tblCellMar>
-            <w:top w:w="0" w:type="dxa"/>
-            <w:bottom w:w="0" w:type="dxa"/>
-          </w:tblCellMar>
-        </w:tblPrEx>
         <w:trPr>
           <w:cantSplit/>
         </w:trPr>
@@ -6671,12 +6461,6 @@
         </w:tc>
       </w:tr>
       <w:tr>
-        <w:tblPrEx>
-          <w:tblCellMar>
-            <w:top w:w="0" w:type="dxa"/>
-            <w:bottom w:w="0" w:type="dxa"/>
-          </w:tblCellMar>
-        </w:tblPrEx>
         <w:trPr>
           <w:cantSplit/>
         </w:trPr>
@@ -6813,12 +6597,6 @@
         </w:tc>
       </w:tr>
       <w:tr>
-        <w:tblPrEx>
-          <w:tblCellMar>
-            <w:top w:w="0" w:type="dxa"/>
-            <w:bottom w:w="0" w:type="dxa"/>
-          </w:tblCellMar>
-        </w:tblPrEx>
         <w:trPr>
           <w:cantSplit/>
         </w:trPr>
@@ -7017,12 +6795,6 @@
         </w:tc>
       </w:tr>
       <w:tr>
-        <w:tblPrEx>
-          <w:tblCellMar>
-            <w:top w:w="0" w:type="dxa"/>
-            <w:bottom w:w="0" w:type="dxa"/>
-          </w:tblCellMar>
-        </w:tblPrEx>
         <w:trPr>
           <w:cantSplit/>
         </w:trPr>
@@ -7186,12 +6958,6 @@
         </w:tc>
       </w:tr>
       <w:tr>
-        <w:tblPrEx>
-          <w:tblCellMar>
-            <w:top w:w="0" w:type="dxa"/>
-            <w:bottom w:w="0" w:type="dxa"/>
-          </w:tblCellMar>
-        </w:tblPrEx>
         <w:trPr>
           <w:cantSplit/>
         </w:trPr>
@@ -7350,12 +7116,6 @@
         </w:tc>
       </w:tr>
       <w:tr>
-        <w:tblPrEx>
-          <w:tblCellMar>
-            <w:top w:w="0" w:type="dxa"/>
-            <w:bottom w:w="0" w:type="dxa"/>
-          </w:tblCellMar>
-        </w:tblPrEx>
         <w:trPr>
           <w:cantSplit/>
         </w:trPr>
@@ -7571,12 +7331,6 @@
         <w:gridCol w:w="3000"/>
       </w:tblGrid>
       <w:tr>
-        <w:tblPrEx>
-          <w:tblCellMar>
-            <w:top w:w="0" w:type="dxa"/>
-            <w:bottom w:w="0" w:type="dxa"/>
-          </w:tblCellMar>
-        </w:tblPrEx>
         <w:trPr>
           <w:tblHeader/>
         </w:trPr>
@@ -7702,12 +7456,6 @@
         </w:tc>
       </w:tr>
       <w:tr>
-        <w:tblPrEx>
-          <w:tblCellMar>
-            <w:top w:w="0" w:type="dxa"/>
-            <w:bottom w:w="0" w:type="dxa"/>
-          </w:tblCellMar>
-        </w:tblPrEx>
         <w:trPr>
           <w:cantSplit/>
         </w:trPr>
@@ -7899,12 +7647,6 @@
         </w:tc>
       </w:tr>
       <w:tr>
-        <w:tblPrEx>
-          <w:tblCellMar>
-            <w:top w:w="0" w:type="dxa"/>
-            <w:bottom w:w="0" w:type="dxa"/>
-          </w:tblCellMar>
-        </w:tblPrEx>
         <w:trPr>
           <w:cantSplit/>
         </w:trPr>
@@ -8091,12 +7833,6 @@
         </w:tc>
       </w:tr>
       <w:tr>
-        <w:tblPrEx>
-          <w:tblCellMar>
-            <w:top w:w="0" w:type="dxa"/>
-            <w:bottom w:w="0" w:type="dxa"/>
-          </w:tblCellMar>
-        </w:tblPrEx>
         <w:trPr>
           <w:cantSplit/>
         </w:trPr>
@@ -8276,12 +8012,6 @@
         </w:tc>
       </w:tr>
       <w:tr>
-        <w:tblPrEx>
-          <w:tblCellMar>
-            <w:top w:w="0" w:type="dxa"/>
-            <w:bottom w:w="0" w:type="dxa"/>
-          </w:tblCellMar>
-        </w:tblPrEx>
         <w:trPr>
           <w:cantSplit/>
         </w:trPr>
@@ -8440,12 +8170,6 @@
         </w:tc>
       </w:tr>
       <w:tr>
-        <w:tblPrEx>
-          <w:tblCellMar>
-            <w:top w:w="0" w:type="dxa"/>
-            <w:bottom w:w="0" w:type="dxa"/>
-          </w:tblCellMar>
-        </w:tblPrEx>
         <w:trPr>
           <w:cantSplit/>
         </w:trPr>
@@ -8673,12 +8397,6 @@
         <w:gridCol w:w="3000"/>
       </w:tblGrid>
       <w:tr>
-        <w:tblPrEx>
-          <w:tblCellMar>
-            <w:top w:w="0" w:type="dxa"/>
-            <w:bottom w:w="0" w:type="dxa"/>
-          </w:tblCellMar>
-        </w:tblPrEx>
         <w:trPr>
           <w:tblHeader/>
         </w:trPr>
@@ -8805,12 +8523,6 @@
         </w:tc>
       </w:tr>
       <w:tr>
-        <w:tblPrEx>
-          <w:tblCellMar>
-            <w:top w:w="0" w:type="dxa"/>
-            <w:bottom w:w="0" w:type="dxa"/>
-          </w:tblCellMar>
-        </w:tblPrEx>
         <w:trPr>
           <w:cantSplit/>
         </w:trPr>
@@ -9020,12 +8732,6 @@
         <w:gridCol w:w="3000"/>
       </w:tblGrid>
       <w:tr>
-        <w:tblPrEx>
-          <w:tblCellMar>
-            <w:top w:w="0" w:type="dxa"/>
-            <w:bottom w:w="0" w:type="dxa"/>
-          </w:tblCellMar>
-        </w:tblPrEx>
         <w:trPr>
           <w:tblHeader/>
         </w:trPr>
@@ -9151,12 +8857,6 @@
         </w:tc>
       </w:tr>
       <w:tr>
-        <w:tblPrEx>
-          <w:tblCellMar>
-            <w:top w:w="0" w:type="dxa"/>
-            <w:bottom w:w="0" w:type="dxa"/>
-          </w:tblCellMar>
-        </w:tblPrEx>
         <w:trPr>
           <w:cantSplit/>
         </w:trPr>
@@ -9354,12 +9054,6 @@
         </w:tc>
       </w:tr>
       <w:tr>
-        <w:tblPrEx>
-          <w:tblCellMar>
-            <w:top w:w="0" w:type="dxa"/>
-            <w:bottom w:w="0" w:type="dxa"/>
-          </w:tblCellMar>
-        </w:tblPrEx>
         <w:trPr>
           <w:cantSplit/>
         </w:trPr>
@@ -9547,17 +9241,7 @@
                 <w:sz w:val="17"/>
                 <w:szCs w:val="17"/>
               </w:rPr>
-              <w:t xml:space="preserve"> </w:t>
-            </w:r>
-            <w:r>
-              <w:rPr>
-                <w:b/>
-                <w:bCs/>
-                <w:color w:val="5A6672"/>
-                <w:sz w:val="17"/>
-                <w:szCs w:val="17"/>
-              </w:rPr>
-              <w:t>.</w:t>
+              <w:t xml:space="preserve"> .</w:t>
             </w:r>
             <w:proofErr w:type="gramEnd"/>
             <w:r>
@@ -9574,12 +9258,6 @@
         </w:tc>
       </w:tr>
       <w:tr>
-        <w:tblPrEx>
-          <w:tblCellMar>
-            <w:top w:w="0" w:type="dxa"/>
-            <w:bottom w:w="0" w:type="dxa"/>
-          </w:tblCellMar>
-        </w:tblPrEx>
         <w:trPr>
           <w:cantSplit/>
         </w:trPr>
@@ -9749,12 +9427,6 @@
         </w:tc>
       </w:tr>
       <w:tr>
-        <w:tblPrEx>
-          <w:tblCellMar>
-            <w:top w:w="0" w:type="dxa"/>
-            <w:bottom w:w="0" w:type="dxa"/>
-          </w:tblCellMar>
-        </w:tblPrEx>
         <w:trPr>
           <w:cantSplit/>
         </w:trPr>
@@ -9942,17 +9614,7 @@
                 <w:sz w:val="17"/>
                 <w:szCs w:val="17"/>
               </w:rPr>
-              <w:t xml:space="preserve"> </w:t>
-            </w:r>
-            <w:r>
-              <w:rPr>
-                <w:b/>
-                <w:bCs/>
-                <w:color w:val="5A6672"/>
-                <w:sz w:val="17"/>
-                <w:szCs w:val="17"/>
-              </w:rPr>
-              <w:t>.</w:t>
+              <w:t xml:space="preserve"> .</w:t>
             </w:r>
             <w:proofErr w:type="gramEnd"/>
             <w:r>
@@ -9969,12 +9631,6 @@
         </w:tc>
       </w:tr>
       <w:tr>
-        <w:tblPrEx>
-          <w:tblCellMar>
-            <w:top w:w="0" w:type="dxa"/>
-            <w:bottom w:w="0" w:type="dxa"/>
-          </w:tblCellMar>
-        </w:tblPrEx>
         <w:trPr>
           <w:cantSplit/>
         </w:trPr>
@@ -10157,17 +9813,7 @@
                 <w:sz w:val="17"/>
                 <w:szCs w:val="17"/>
               </w:rPr>
-              <w:t xml:space="preserve"> </w:t>
-            </w:r>
-            <w:r>
-              <w:rPr>
-                <w:b/>
-                <w:bCs/>
-                <w:color w:val="5A6672"/>
-                <w:sz w:val="17"/>
-                <w:szCs w:val="17"/>
-              </w:rPr>
-              <w:t>.</w:t>
+              <w:t xml:space="preserve"> .</w:t>
             </w:r>
             <w:proofErr w:type="gramEnd"/>
             <w:r>
@@ -10184,12 +9830,6 @@
         </w:tc>
       </w:tr>
       <w:tr>
-        <w:tblPrEx>
-          <w:tblCellMar>
-            <w:top w:w="0" w:type="dxa"/>
-            <w:bottom w:w="0" w:type="dxa"/>
-          </w:tblCellMar>
-        </w:tblPrEx>
         <w:trPr>
           <w:cantSplit/>
         </w:trPr>
@@ -10384,12 +10024,6 @@
         </w:tc>
       </w:tr>
       <w:tr>
-        <w:tblPrEx>
-          <w:tblCellMar>
-            <w:top w:w="0" w:type="dxa"/>
-            <w:bottom w:w="0" w:type="dxa"/>
-          </w:tblCellMar>
-        </w:tblPrEx>
         <w:trPr>
           <w:cantSplit/>
         </w:trPr>
@@ -10572,17 +10206,7 @@
                 <w:sz w:val="17"/>
                 <w:szCs w:val="17"/>
               </w:rPr>
-              <w:t xml:space="preserve"> </w:t>
-            </w:r>
-            <w:r>
-              <w:rPr>
-                <w:b/>
-                <w:bCs/>
-                <w:color w:val="5A6672"/>
-                <w:sz w:val="17"/>
-                <w:szCs w:val="17"/>
-              </w:rPr>
-              <w:t>.</w:t>
+              <w:t xml:space="preserve"> .</w:t>
             </w:r>
             <w:proofErr w:type="gramEnd"/>
             <w:r>
@@ -10645,12 +10269,6 @@
         <w:gridCol w:w="3000"/>
       </w:tblGrid>
       <w:tr>
-        <w:tblPrEx>
-          <w:tblCellMar>
-            <w:top w:w="0" w:type="dxa"/>
-            <w:bottom w:w="0" w:type="dxa"/>
-          </w:tblCellMar>
-        </w:tblPrEx>
         <w:trPr>
           <w:tblHeader/>
         </w:trPr>
@@ -10776,12 +10394,6 @@
         </w:tc>
       </w:tr>
       <w:tr>
-        <w:tblPrEx>
-          <w:tblCellMar>
-            <w:top w:w="0" w:type="dxa"/>
-            <w:bottom w:w="0" w:type="dxa"/>
-          </w:tblCellMar>
-        </w:tblPrEx>
         <w:trPr>
           <w:cantSplit/>
         </w:trPr>
@@ -10843,40 +10455,19 @@
             <w:pPr>
               <w:spacing w:line="230" w:lineRule="auto"/>
             </w:pPr>
-            <w:r>
-              <w:fldChar w:fldCharType="begin"/>
-            </w:r>
-            <w:r>
-              <w:instrText>HYPERLINK \l "step_3_5"</w:instrText>
-            </w:r>
-            <w:r>
-              <w:fldChar w:fldCharType="separate"/>
-            </w:r>
-            <w:r>
-              <w:rPr>
-                <w:b/>
-                <w:bCs/>
-                <w:color w:val="1B4F72"/>
-                <w:sz w:val="18"/>
-                <w:szCs w:val="18"/>
-                <w:u w:val="single" w:color="1B4F72"/>
-              </w:rPr>
-              <w:t>3.</w:t>
-            </w:r>
-            <w:r>
-              <w:rPr>
-                <w:b/>
-                <w:bCs/>
-                <w:color w:val="1B4F72"/>
-                <w:sz w:val="18"/>
-                <w:szCs w:val="18"/>
-                <w:u w:val="single" w:color="1B4F72"/>
-              </w:rPr>
-              <w:t>5</w:t>
-            </w:r>
-            <w:r>
-              <w:fldChar w:fldCharType="end"/>
-            </w:r>
+            <w:hyperlink w:anchor="step_3_5" w:history="1">
+              <w:r>
+                <w:rPr>
+                  <w:b/>
+                  <w:bCs/>
+                  <w:color w:val="1B4F72"/>
+                  <w:sz w:val="18"/>
+                  <w:szCs w:val="18"/>
+                  <w:u w:val="single" w:color="1B4F72"/>
+                </w:rPr>
+                <w:t>3.5</w:t>
+              </w:r>
+            </w:hyperlink>
           </w:p>
         </w:tc>
         <w:tc>
@@ -11004,12 +10595,6 @@
         </w:tc>
       </w:tr>
       <w:tr>
-        <w:tblPrEx>
-          <w:tblCellMar>
-            <w:top w:w="0" w:type="dxa"/>
-            <w:bottom w:w="0" w:type="dxa"/>
-          </w:tblCellMar>
-        </w:tblPrEx>
         <w:trPr>
           <w:cantSplit/>
         </w:trPr>
@@ -11168,12 +10753,6 @@
         </w:tc>
       </w:tr>
       <w:tr>
-        <w:tblPrEx>
-          <w:tblCellMar>
-            <w:top w:w="0" w:type="dxa"/>
-            <w:bottom w:w="0" w:type="dxa"/>
-          </w:tblCellMar>
-        </w:tblPrEx>
         <w:trPr>
           <w:cantSplit/>
         </w:trPr>
@@ -11402,12 +10981,6 @@
         <w:gridCol w:w="3000"/>
       </w:tblGrid>
       <w:tr>
-        <w:tblPrEx>
-          <w:tblCellMar>
-            <w:top w:w="0" w:type="dxa"/>
-            <w:bottom w:w="0" w:type="dxa"/>
-          </w:tblCellMar>
-        </w:tblPrEx>
         <w:trPr>
           <w:tblHeader/>
         </w:trPr>
@@ -11533,12 +11106,6 @@
         </w:tc>
       </w:tr>
       <w:tr>
-        <w:tblPrEx>
-          <w:tblCellMar>
-            <w:top w:w="0" w:type="dxa"/>
-            <w:bottom w:w="0" w:type="dxa"/>
-          </w:tblCellMar>
-        </w:tblPrEx>
         <w:trPr>
           <w:cantSplit/>
         </w:trPr>
@@ -11748,12 +11315,6 @@
         <w:gridCol w:w="3000"/>
       </w:tblGrid>
       <w:tr>
-        <w:tblPrEx>
-          <w:tblCellMar>
-            <w:top w:w="0" w:type="dxa"/>
-            <w:bottom w:w="0" w:type="dxa"/>
-          </w:tblCellMar>
-        </w:tblPrEx>
         <w:trPr>
           <w:tblHeader/>
         </w:trPr>
@@ -11879,12 +11440,6 @@
         </w:tc>
       </w:tr>
       <w:tr>
-        <w:tblPrEx>
-          <w:tblCellMar>
-            <w:top w:w="0" w:type="dxa"/>
-            <w:bottom w:w="0" w:type="dxa"/>
-          </w:tblCellMar>
-        </w:tblPrEx>
         <w:trPr>
           <w:cantSplit/>
         </w:trPr>
@@ -11956,7 +11511,29 @@
                   <w:szCs w:val="18"/>
                   <w:u w:val="single" w:color="1B4F72"/>
                 </w:rPr>
-                <w:t>3.2</w:t>
+                <w:t>3</w:t>
+              </w:r>
+              <w:r>
+                <w:rPr>
+                  <w:b/>
+                  <w:bCs/>
+                  <w:color w:val="1B4F72"/>
+                  <w:sz w:val="18"/>
+                  <w:szCs w:val="18"/>
+                  <w:u w:val="single" w:color="1B4F72"/>
+                </w:rPr>
+                <w:t>.</w:t>
+              </w:r>
+              <w:r>
+                <w:rPr>
+                  <w:b/>
+                  <w:bCs/>
+                  <w:color w:val="1B4F72"/>
+                  <w:sz w:val="18"/>
+                  <w:szCs w:val="18"/>
+                  <w:u w:val="single" w:color="1B4F72"/>
+                </w:rPr>
+                <w:t>2</w:t>
               </w:r>
             </w:hyperlink>
           </w:p>
@@ -12038,12 +11615,6 @@
         </w:tc>
       </w:tr>
       <w:tr>
-        <w:tblPrEx>
-          <w:tblCellMar>
-            <w:top w:w="0" w:type="dxa"/>
-            <w:bottom w:w="0" w:type="dxa"/>
-          </w:tblCellMar>
-        </w:tblPrEx>
         <w:trPr>
           <w:cantSplit/>
         </w:trPr>
@@ -12258,12 +11829,6 @@
         <w:gridCol w:w="3000"/>
       </w:tblGrid>
       <w:tr>
-        <w:tblPrEx>
-          <w:tblCellMar>
-            <w:top w:w="0" w:type="dxa"/>
-            <w:bottom w:w="0" w:type="dxa"/>
-          </w:tblCellMar>
-        </w:tblPrEx>
         <w:trPr>
           <w:tblHeader/>
         </w:trPr>
@@ -12389,12 +11954,6 @@
         </w:tc>
       </w:tr>
       <w:tr>
-        <w:tblPrEx>
-          <w:tblCellMar>
-            <w:top w:w="0" w:type="dxa"/>
-            <w:bottom w:w="0" w:type="dxa"/>
-          </w:tblCellMar>
-        </w:tblPrEx>
         <w:trPr>
           <w:cantSplit/>
         </w:trPr>
@@ -12548,12 +12107,6 @@
         </w:tc>
       </w:tr>
       <w:tr>
-        <w:tblPrEx>
-          <w:tblCellMar>
-            <w:top w:w="0" w:type="dxa"/>
-            <w:bottom w:w="0" w:type="dxa"/>
-          </w:tblCellMar>
-        </w:tblPrEx>
         <w:trPr>
           <w:cantSplit/>
         </w:trPr>
@@ -12722,12 +12275,6 @@
         </w:tc>
       </w:tr>
       <w:tr>
-        <w:tblPrEx>
-          <w:tblCellMar>
-            <w:top w:w="0" w:type="dxa"/>
-            <w:bottom w:w="0" w:type="dxa"/>
-          </w:tblCellMar>
-        </w:tblPrEx>
         <w:trPr>
           <w:cantSplit/>
         </w:trPr>
@@ -12881,12 +12428,6 @@
         </w:tc>
       </w:tr>
       <w:tr>
-        <w:tblPrEx>
-          <w:tblCellMar>
-            <w:top w:w="0" w:type="dxa"/>
-            <w:bottom w:w="0" w:type="dxa"/>
-          </w:tblCellMar>
-        </w:tblPrEx>
         <w:trPr>
           <w:cantSplit/>
         </w:trPr>
@@ -13073,12 +12614,6 @@
         <w:gridCol w:w="3000"/>
       </w:tblGrid>
       <w:tr>
-        <w:tblPrEx>
-          <w:tblCellMar>
-            <w:top w:w="0" w:type="dxa"/>
-            <w:bottom w:w="0" w:type="dxa"/>
-          </w:tblCellMar>
-        </w:tblPrEx>
         <w:trPr>
           <w:tblHeader/>
         </w:trPr>
@@ -13204,12 +12739,6 @@
         </w:tc>
       </w:tr>
       <w:tr>
-        <w:tblPrEx>
-          <w:tblCellMar>
-            <w:top w:w="0" w:type="dxa"/>
-            <w:bottom w:w="0" w:type="dxa"/>
-          </w:tblCellMar>
-        </w:tblPrEx>
         <w:trPr>
           <w:cantSplit/>
         </w:trPr>
@@ -13430,12 +12959,6 @@
         <w:gridCol w:w="2680"/>
       </w:tblGrid>
       <w:tr>
-        <w:tblPrEx>
-          <w:tblCellMar>
-            <w:top w:w="0" w:type="dxa"/>
-            <w:bottom w:w="0" w:type="dxa"/>
-          </w:tblCellMar>
-        </w:tblPrEx>
         <w:trPr>
           <w:tblHeader/>
         </w:trPr>
@@ -13513,12 +13036,6 @@
         </w:tc>
       </w:tr>
       <w:tr>
-        <w:tblPrEx>
-          <w:tblCellMar>
-            <w:top w:w="0" w:type="dxa"/>
-            <w:bottom w:w="0" w:type="dxa"/>
-          </w:tblCellMar>
-        </w:tblPrEx>
         <w:trPr>
           <w:cantSplit/>
         </w:trPr>
@@ -13586,12 +13103,6 @@
         </w:tc>
       </w:tr>
       <w:tr>
-        <w:tblPrEx>
-          <w:tblCellMar>
-            <w:top w:w="0" w:type="dxa"/>
-            <w:bottom w:w="0" w:type="dxa"/>
-          </w:tblCellMar>
-        </w:tblPrEx>
         <w:trPr>
           <w:cantSplit/>
         </w:trPr>
@@ -13662,12 +13173,6 @@
         </w:tc>
       </w:tr>
       <w:tr>
-        <w:tblPrEx>
-          <w:tblCellMar>
-            <w:top w:w="0" w:type="dxa"/>
-            <w:bottom w:w="0" w:type="dxa"/>
-          </w:tblCellMar>
-        </w:tblPrEx>
         <w:trPr>
           <w:cantSplit/>
         </w:trPr>
@@ -13735,12 +13240,6 @@
         </w:tc>
       </w:tr>
       <w:tr>
-        <w:tblPrEx>
-          <w:tblCellMar>
-            <w:top w:w="0" w:type="dxa"/>
-            <w:bottom w:w="0" w:type="dxa"/>
-          </w:tblCellMar>
-        </w:tblPrEx>
         <w:trPr>
           <w:cantSplit/>
         </w:trPr>
@@ -13827,12 +13326,6 @@
         </w:tc>
       </w:tr>
       <w:tr>
-        <w:tblPrEx>
-          <w:tblCellMar>
-            <w:top w:w="0" w:type="dxa"/>
-            <w:bottom w:w="0" w:type="dxa"/>
-          </w:tblCellMar>
-        </w:tblPrEx>
         <w:trPr>
           <w:cantSplit/>
         </w:trPr>
@@ -14839,6 +14332,30 @@
       <w:szCs w:val="20"/>
     </w:rPr>
   </w:style>
+  <w:style w:type="character" w:styleId="UnresolvedMention">
+    <w:name w:val="Unresolved Mention"/>
+    <w:basedOn w:val="DefaultParagraphFont"/>
+    <w:uiPriority w:val="99"/>
+    <w:semiHidden/>
+    <w:unhideWhenUsed/>
+    <w:rsid w:val="00CA528D"/>
+    <w:rPr>
+      <w:color w:val="605E5C"/>
+      <w:shd w:val="clear" w:color="auto" w:fill="E1DFDD"/>
+    </w:rPr>
+  </w:style>
+  <w:style w:type="character" w:styleId="FollowedHyperlink">
+    <w:name w:val="FollowedHyperlink"/>
+    <w:basedOn w:val="DefaultParagraphFont"/>
+    <w:uiPriority w:val="99"/>
+    <w:semiHidden/>
+    <w:unhideWhenUsed/>
+    <w:rsid w:val="00CA528D"/>
+    <w:rPr>
+      <w:color w:val="954F72" w:themeColor="followedHyperlink"/>
+      <w:u w:val="single"/>
+    </w:rPr>
+  </w:style>
 </w:styles>
 </file>
 

</xml_diff>